<commit_message>
Add integrated email memory agent
</commit_message>
<xml_diff>
--- a/9-Email-Assistant/Email_Assistant_Memory_Map.docx
+++ b/9-Email-Assistant/Email_Assistant_Memory_Map.docx
@@ -27,7 +27,7 @@
           <w:color w:val="657381"/>
           <w:sz w:val="19"/>
         </w:rPr>
-        <w:t>Reference name: Email Assistant Memory Map  •  Current state: short-term, semantic, episodic, and procedural</w:t>
+        <w:t>Reference name: Email Assistant Memory Map  •  Implemented together in Lesson 8</w:t>
       </w:r>
     </w:p>
     <w:p>
@@ -50,7 +50,7 @@
           <w:color w:val="17324D"/>
           <w:sz w:val="20"/>
         </w:rPr>
-        <w:t>Saver remembers one thread. Store keeps selected information across threads. Store memory is isolated per user_id; checkpoints are isolated per thread_id. “In-memory” means both disappear when the Python process stops.</w:t>
+        <w:t>Saver remembers one thread. Store keeps selected information across threads. Store memory is isolated per user_id; checkpoints are isolated per thread_id. Lesson 8 combines all four paths in one graph and one shared Store instance. “In-memory” means both disappear when the Python process stops.</w:t>
       </w:r>
     </w:p>
     <w:p>
@@ -73,7 +73,7 @@
           <w:color w:val="17324D"/>
           <w:sz w:val="19"/>
         </w:rPr>
-        <w:t>openai:text-embedding-3-small powers similarity search. Episodic examples come from human-approved corrections. Procedural rules use exact keys; a separate GPT optimizer proposes updates that the application saves.</w:t>
+        <w:t>openai:text-embedding-3-small powers similarity search. Episodic examples come from user-corrected labels. Procedural feedback describes desired behavior; a separate LangMem create_multi_prompt_optimizer call, powered by GPT-4o-mini, proposes rule updates that the application saves. The router and optimizer use the same model name through different calls and prompts.</w:t>
       </w:r>
     </w:p>
     <w:p>
@@ -543,7 +543,7 @@
                 <w:color w:val="17324D"/>
                 <w:sz w:val="18"/>
               </w:rPr>
-              <w:t>Human/app—not GPT—saves the approved {email, label}.</w:t>
+              <w:t>User corrects a label; app—not GPT—saves approved {email, label}.</w:t>
             </w:r>
           </w:p>
         </w:tc>
@@ -663,7 +663,7 @@
                 <w:color w:val="17324D"/>
                 <w:sz w:val="18"/>
               </w:rPr>
-              <w:t>Optimizer GPT proposes changes; the app saves approved instructions.</w:t>
+              <w:t>User feedback → create_multi_prompt_optimizer proposes → app put().</w:t>
             </w:r>
           </w:p>
         </w:tc>
@@ -692,7 +692,7 @@
                 <w:color w:val="17324D"/>
                 <w:sz w:val="18"/>
               </w:rPr>
-              <w:t>Application uses exact get(); router/agent GPT follows the rules.</w:t>
+              <w:t>Each invoke: get() rules → rebuild system prompt → router GPT.</w:t>
             </w:r>
           </w:p>
         </w:tc>
@@ -740,7 +740,7 @@
           <w:color w:val="7656A5"/>
           <w:sz w:val="18"/>
         </w:rPr>
-        <w:t xml:space="preserve">Remember  </w:t>
+        <w:t xml:space="preserve">Feedback roles  </w:t>
       </w:r>
       <w:r>
         <w:rPr>
@@ -749,7 +749,7 @@
           <w:color w:val="17324D"/>
           <w:sz w:val="18"/>
         </w:rPr>
-        <w:t>Episodic memory is what is stored; semantic search is how a relevant episode is selected; few-shot prompting is how it is used. Human review is selective—not requested after every classification—and the current lesson simulates the feedback.</w:t>
+        <w:t>Episodic feedback corrects one past outcome and creates a trusted example. Procedural feedback changes stored instructions. On every later invocation, the app loads the latest rules, rebuilds the system prompt, then calls the router/agent GPT. Review is selective, and these lessons simulate it.</w:t>
       </w:r>
     </w:p>
     <w:p>

</xml_diff>